<commit_message>
Local uncommitted work snapshot
</commit_message>
<xml_diff>
--- a/whiteboard/Sujeth_Complete_Audit_June2026.docx
+++ b/whiteboard/Sujeth_Complete_Audit_June2026.docx
@@ -1779,7 +1779,7 @@
           <w:sz w:val="22"/>
           <w:szCs w:val="22"/>
         </w:rPr>
-        <w:t xml:space="preserve"> — Possah (thepossah.com), Synthesis, Zingara, Fitness Garage — all live. This is rare for a student.</w:t>
+        <w:t xml:space="preserve"> — Possah (thepossah.com), Synaptic, Zingara, Fitness Garage — all live. This is rare for a student.</w:t>
       </w:r>
     </w:p>
     <w:p>
@@ -4066,7 +4066,7 @@
           <w:sz w:val="22"/>
           <w:szCs w:val="22"/>
         </w:rPr>
-        <w:t xml:space="preserve"> — Add Possah, Synthesis, Blueprint Builder, Zingara, Fitness Garage as projects with descriptions and links.</w:t>
+        <w:t xml:space="preserve"> — Add Possah, Synaptic, Blueprint Builder, Zingara, Fitness Garage as projects with descriptions and links.</w:t>
       </w:r>
     </w:p>
     <w:p>
@@ -4142,7 +4142,7 @@
           <w:sz w:val="22"/>
           <w:szCs w:val="22"/>
         </w:rPr>
-        <w:t xml:space="preserve"> — Pin your portfolio URL, Possah link, and Synthesis demo.</w:t>
+        <w:t xml:space="preserve"> — Pin your portfolio URL, Possah link, and Synaptic demo.</w:t>
       </w:r>
     </w:p>
     <w:p>
@@ -4402,7 +4402,7 @@
           <w:sz w:val="22"/>
           <w:szCs w:val="22"/>
         </w:rPr>
-        <w:t xml:space="preserve"> — Synthesis, Possah, Zingara, Fitness Garage — correct choices.</w:t>
+        <w:t xml:space="preserve"> — Synaptic, Possah, Zingara, Fitness Garage — correct choices.</w:t>
       </w:r>
     </w:p>
     <w:p>

</xml_diff>